<commit_message>
fix: screenshot review: version strings, evidence ledger print, tidy images
- /version printed "OpenHarness 0.1.6"; now the installed Impact Vision
  version. OpenAI client User-Agent no longer hard-codes 0.14.0.
- Evidence ledger gets fixed column widths (claim column no longer
  collapses in the PDF); masthead date stays on one line on mobile.
- 5D notes pluralise correctly and read "N reported · X of Y reference".
- zh language note mentions DD questions shown in the original.
- Remove 4 unused images; regenerate demo + all screenshots (web chat
  shows v0.17.1); height-capped captures cut at a row boundary.

Co-Authored-By: Claude Opus 5.5 <noreply@anthropic.com>
</commit_message>
<xml_diff>
--- a/demo/brightpath_finance/brightpath_finance_ic_memo.docx
+++ b/demo/brightpath_finance/brightpath_finance_ic_memo.docx
@@ -307,7 +307,7 @@
               <w:rPr>
                 <w:sz w:val="19"/>
               </w:rPr>
-              <w:t>Reporting 2 metrics (0 theme-specific, 14 available)</w:t>
+              <w:t>2 metrics reported · 0 of 14 reference metrics</w:t>
             </w:r>
           </w:p>
         </w:tc>
@@ -377,7 +377,7 @@
               <w:rPr>
                 <w:sz w:val="19"/>
               </w:rPr>
-              <w:t>Reporting 5 metrics (0 theme-specific, 6 available)</w:t>
+              <w:t>5 metrics reported · 0 of 6 reference metrics</w:t>
             </w:r>
           </w:p>
         </w:tc>
@@ -587,7 +587,7 @@
               <w:rPr>
                 <w:sz w:val="19"/>
               </w:rPr>
-              <w:t>Estimated from sector/description (4 metrics available to track)</w:t>
+              <w:t>Estimated from sector/description · 4 reference metrics to track</w:t>
             </w:r>
           </w:p>
         </w:tc>

</xml_diff>

<commit_message>
feat: portfolio home shows stage, expected impact and evidence; totals in natural units (v8 W1.10, W3.1)
Portfolio vs pipeline from the company record; expected impact summed per
unit across invested companies (or the pipeline before any investment),
never an average of ordinal scores; per-company Impact P50 and Evidence
columns in the heat-map.

Co-Authored-By: Claude Opus 5.5 <noreply@anthropic.com>
</commit_message>
<xml_diff>
--- a/demo/brightpath_finance/brightpath_finance_ic_memo.docx
+++ b/demo/brightpath_finance/brightpath_finance_ic_memo.docx
@@ -137,7 +137,7 @@
         <w:rPr>
           <w:b/>
         </w:rPr>
-        <w:t>8,700</w:t>
+        <w:t>9,000</w:t>
       </w:r>
       <w:r>
         <w:t xml:space="preserve"> depth-weighted person-years (P10 2,700 – P90 30,000; wide uncertainty)</w:t>
@@ -153,7 +153,7 @@
     </w:p>
     <w:p>
       <w:r>
-        <w:t>1. Compare with a group that did not get the product (a comparison group or a credible baseline), ideally run by someone independent. — Moves evidence from level 2 to 3, nets out deadweight and narrows the range (now ×11.0 from P10 to P90).</w:t>
+        <w:t>1. Compare with a group that did not get the product (a comparison group or a credible baseline), ideally run by someone independent. — Moves evidence from level 2 to 3, nets out deadweight and narrows the range (now ×11.1 from P10 to P90).</w:t>
       </w:r>
     </w:p>
     <w:p>

</xml_diff>